<commit_message>
Simplificando MMRR y cambiando tablas de dbRDA
</commit_message>
<xml_diff>
--- a/avena_ncbi/tablas_dbRDA.docx
+++ b/avena_ncbi/tablas_dbRDA.docx
@@ -376,6 +376,7 @@
         </w:trPr>
         <w:tc>
           <w:tcPr>
+            <w:vMerge w:val="restart"/>
             <w:tcBorders>
               <w:bottom w:val="none" w:sz="0" w:space="0" w:color="000000"/>
               <w:top w:val="single" w:sz="12" w:space="0" w:color="666666"/>
@@ -711,6 +712,7 @@
         </w:trPr>
         <w:tc>
           <w:tcPr>
+            <w:vMerge/>
             <w:tcBorders>
               <w:bottom w:val="none" w:sz="0" w:space="0" w:color="000000"/>
               <w:top w:val="none" w:sz="0" w:space="0" w:color="000000"/>
@@ -749,19 +751,6 @@
                 <w:color w:val="000000"/>
               </w:rPr>
             </w:pPr>
-            <w:r>
-              <w:rPr>
-                <w:rFonts w:ascii="Arial" w:hAnsi="Arial" w:eastAsia="Arial" w:cs="Arial"/>
-                <w:i w:val="false"/>
-                <w:b w:val="false"/>
-                <w:u w:val="none"/>
-                <w:strike w:val="false"/>
-                <w:sz w:val="20"/>
-                <w:szCs w:val="20"/>
-                <w:color w:val="000000"/>
-              </w:rPr>
-              <w:t xml:space="preserve">All</w:t>
-            </w:r>
           </w:p>
         </w:tc>
         <w:tc>
@@ -980,7 +969,7 @@
                 <w:szCs w:val="20"/>
                 <w:color w:val="000000"/>
               </w:rPr>
-              <w:t xml:space="preserve">0.443</w:t>
+              <w:t xml:space="preserve">0.438</w:t>
             </w:r>
           </w:p>
         </w:tc>
@@ -1046,6 +1035,7 @@
         </w:trPr>
         <w:tc>
           <w:tcPr>
+            <w:vMerge/>
             <w:tcBorders>
               <w:bottom w:val="none" w:sz="0" w:space="0" w:color="000000"/>
               <w:top w:val="none" w:sz="0" w:space="0" w:color="000000"/>
@@ -1084,19 +1074,6 @@
                 <w:color w:val="000000"/>
               </w:rPr>
             </w:pPr>
-            <w:r>
-              <w:rPr>
-                <w:rFonts w:ascii="Arial" w:hAnsi="Arial" w:eastAsia="Arial" w:cs="Arial"/>
-                <w:i w:val="false"/>
-                <w:b w:val="false"/>
-                <w:u w:val="none"/>
-                <w:strike w:val="false"/>
-                <w:sz w:val="20"/>
-                <w:szCs w:val="20"/>
-                <w:color w:val="000000"/>
-              </w:rPr>
-              <w:t xml:space="preserve">All</w:t>
-            </w:r>
           </w:p>
         </w:tc>
         <w:tc>
@@ -1381,6 +1358,7 @@
         </w:trPr>
         <w:tc>
           <w:tcPr>
+            <w:vMerge/>
             <w:tcBorders>
               <w:bottom w:val="none" w:sz="0" w:space="0" w:color="000000"/>
               <w:top w:val="none" w:sz="0" w:space="0" w:color="000000"/>
@@ -1419,19 +1397,6 @@
                 <w:color w:val="000000"/>
               </w:rPr>
             </w:pPr>
-            <w:r>
-              <w:rPr>
-                <w:rFonts w:ascii="Arial" w:hAnsi="Arial" w:eastAsia="Arial" w:cs="Arial"/>
-                <w:i w:val="false"/>
-                <w:b w:val="false"/>
-                <w:u w:val="none"/>
-                <w:strike w:val="false"/>
-                <w:sz w:val="20"/>
-                <w:szCs w:val="20"/>
-                <w:color w:val="000000"/>
-              </w:rPr>
-              <w:t xml:space="preserve">All</w:t>
-            </w:r>
           </w:p>
         </w:tc>
         <w:tc>
@@ -1716,6 +1681,7 @@
         </w:trPr>
         <w:tc>
           <w:tcPr>
+            <w:vMerge/>
             <w:tcBorders>
               <w:bottom w:val="none" w:sz="0" w:space="0" w:color="000000"/>
               <w:top w:val="none" w:sz="0" w:space="0" w:color="000000"/>
@@ -1754,19 +1720,6 @@
                 <w:color w:val="000000"/>
               </w:rPr>
             </w:pPr>
-            <w:r>
-              <w:rPr>
-                <w:rFonts w:ascii="Arial" w:hAnsi="Arial" w:eastAsia="Arial" w:cs="Arial"/>
-                <w:i w:val="false"/>
-                <w:b w:val="false"/>
-                <w:u w:val="none"/>
-                <w:strike w:val="false"/>
-                <w:sz w:val="20"/>
-                <w:szCs w:val="20"/>
-                <w:color w:val="000000"/>
-              </w:rPr>
-              <w:t xml:space="preserve">All</w:t>
-            </w:r>
           </w:p>
         </w:tc>
         <w:tc>
@@ -2051,6 +2004,7 @@
         </w:trPr>
         <w:tc>
           <w:tcPr>
+            <w:vMerge w:val="restart"/>
             <w:tcBorders>
               <w:bottom w:val="none" w:sz="0" w:space="0" w:color="000000"/>
               <w:top w:val="none" w:sz="0" w:space="0" w:color="000000"/>
@@ -2386,6 +2340,7 @@
         </w:trPr>
         <w:tc>
           <w:tcPr>
+            <w:vMerge/>
             <w:tcBorders>
               <w:bottom w:val="none" w:sz="0" w:space="0" w:color="000000"/>
               <w:top w:val="none" w:sz="0" w:space="0" w:color="000000"/>
@@ -2424,19 +2379,6 @@
                 <w:color w:val="000000"/>
               </w:rPr>
             </w:pPr>
-            <w:r>
-              <w:rPr>
-                <w:rFonts w:ascii="Arial" w:hAnsi="Arial" w:eastAsia="Arial" w:cs="Arial"/>
-                <w:i w:val="false"/>
-                <w:b w:val="false"/>
-                <w:u w:val="none"/>
-                <w:strike w:val="false"/>
-                <w:sz w:val="20"/>
-                <w:szCs w:val="20"/>
-                <w:color w:val="000000"/>
-              </w:rPr>
-              <w:t xml:space="preserve">CG</w:t>
-            </w:r>
           </w:p>
         </w:tc>
         <w:tc>
@@ -2655,7 +2597,7 @@
                 <w:szCs w:val="20"/>
                 <w:color w:val="000000"/>
               </w:rPr>
-              <w:t xml:space="preserve">0.450</w:t>
+              <w:t xml:space="preserve">0.454</w:t>
             </w:r>
           </w:p>
         </w:tc>
@@ -2721,6 +2663,7 @@
         </w:trPr>
         <w:tc>
           <w:tcPr>
+            <w:vMerge/>
             <w:tcBorders>
               <w:bottom w:val="none" w:sz="0" w:space="0" w:color="000000"/>
               <w:top w:val="none" w:sz="0" w:space="0" w:color="000000"/>
@@ -2759,19 +2702,6 @@
                 <w:color w:val="000000"/>
               </w:rPr>
             </w:pPr>
-            <w:r>
-              <w:rPr>
-                <w:rFonts w:ascii="Arial" w:hAnsi="Arial" w:eastAsia="Arial" w:cs="Arial"/>
-                <w:i w:val="false"/>
-                <w:b w:val="false"/>
-                <w:u w:val="none"/>
-                <w:strike w:val="false"/>
-                <w:sz w:val="20"/>
-                <w:szCs w:val="20"/>
-                <w:color w:val="000000"/>
-              </w:rPr>
-              <w:t xml:space="preserve">CG</w:t>
-            </w:r>
           </w:p>
         </w:tc>
         <w:tc>
@@ -3056,6 +2986,7 @@
         </w:trPr>
         <w:tc>
           <w:tcPr>
+            <w:vMerge/>
             <w:tcBorders>
               <w:bottom w:val="none" w:sz="0" w:space="0" w:color="000000"/>
               <w:top w:val="none" w:sz="0" w:space="0" w:color="000000"/>
@@ -3094,19 +3025,6 @@
                 <w:color w:val="000000"/>
               </w:rPr>
             </w:pPr>
-            <w:r>
-              <w:rPr>
-                <w:rFonts w:ascii="Arial" w:hAnsi="Arial" w:eastAsia="Arial" w:cs="Arial"/>
-                <w:i w:val="false"/>
-                <w:b w:val="false"/>
-                <w:u w:val="none"/>
-                <w:strike w:val="false"/>
-                <w:sz w:val="20"/>
-                <w:szCs w:val="20"/>
-                <w:color w:val="000000"/>
-              </w:rPr>
-              <w:t xml:space="preserve">CG</w:t>
-            </w:r>
           </w:p>
         </w:tc>
         <w:tc>
@@ -3391,6 +3309,7 @@
         </w:trPr>
         <w:tc>
           <w:tcPr>
+            <w:vMerge/>
             <w:tcBorders>
               <w:bottom w:val="none" w:sz="0" w:space="0" w:color="000000"/>
               <w:top w:val="none" w:sz="0" w:space="0" w:color="000000"/>
@@ -3429,19 +3348,6 @@
                 <w:color w:val="000000"/>
               </w:rPr>
             </w:pPr>
-            <w:r>
-              <w:rPr>
-                <w:rFonts w:ascii="Arial" w:hAnsi="Arial" w:eastAsia="Arial" w:cs="Arial"/>
-                <w:i w:val="false"/>
-                <w:b w:val="false"/>
-                <w:u w:val="none"/>
-                <w:strike w:val="false"/>
-                <w:sz w:val="20"/>
-                <w:szCs w:val="20"/>
-                <w:color w:val="000000"/>
-              </w:rPr>
-              <w:t xml:space="preserve">CG</w:t>
-            </w:r>
           </w:p>
         </w:tc>
         <w:tc>
@@ -3726,6 +3632,7 @@
         </w:trPr>
         <w:tc>
           <w:tcPr>
+            <w:vMerge w:val="restart"/>
             <w:tcBorders>
               <w:bottom w:val="none" w:sz="0" w:space="0" w:color="000000"/>
               <w:top w:val="none" w:sz="0" w:space="0" w:color="000000"/>
@@ -4061,6 +3968,7 @@
         </w:trPr>
         <w:tc>
           <w:tcPr>
+            <w:vMerge/>
             <w:tcBorders>
               <w:bottom w:val="none" w:sz="0" w:space="0" w:color="000000"/>
               <w:top w:val="none" w:sz="0" w:space="0" w:color="000000"/>
@@ -4099,19 +4007,6 @@
                 <w:color w:val="000000"/>
               </w:rPr>
             </w:pPr>
-            <w:r>
-              <w:rPr>
-                <w:rFonts w:ascii="Arial" w:hAnsi="Arial" w:eastAsia="Arial" w:cs="Arial"/>
-                <w:i w:val="false"/>
-                <w:b w:val="false"/>
-                <w:u w:val="none"/>
-                <w:strike w:val="false"/>
-                <w:sz w:val="20"/>
-                <w:szCs w:val="20"/>
-                <w:color w:val="000000"/>
-              </w:rPr>
-              <w:t xml:space="preserve">CHG</w:t>
-            </w:r>
           </w:p>
         </w:tc>
         <w:tc>
@@ -4330,7 +4225,7 @@
                 <w:szCs w:val="20"/>
                 <w:color w:val="000000"/>
               </w:rPr>
-              <w:t xml:space="preserve">0.483</w:t>
+              <w:t xml:space="preserve">0.480</w:t>
             </w:r>
           </w:p>
         </w:tc>
@@ -4396,6 +4291,7 @@
         </w:trPr>
         <w:tc>
           <w:tcPr>
+            <w:vMerge/>
             <w:tcBorders>
               <w:bottom w:val="none" w:sz="0" w:space="0" w:color="000000"/>
               <w:top w:val="none" w:sz="0" w:space="0" w:color="000000"/>
@@ -4434,19 +4330,6 @@
                 <w:color w:val="000000"/>
               </w:rPr>
             </w:pPr>
-            <w:r>
-              <w:rPr>
-                <w:rFonts w:ascii="Arial" w:hAnsi="Arial" w:eastAsia="Arial" w:cs="Arial"/>
-                <w:i w:val="false"/>
-                <w:b w:val="false"/>
-                <w:u w:val="none"/>
-                <w:strike w:val="false"/>
-                <w:sz w:val="20"/>
-                <w:szCs w:val="20"/>
-                <w:color w:val="000000"/>
-              </w:rPr>
-              <w:t xml:space="preserve">CHG</w:t>
-            </w:r>
           </w:p>
         </w:tc>
         <w:tc>
@@ -4731,6 +4614,7 @@
         </w:trPr>
         <w:tc>
           <w:tcPr>
+            <w:vMerge/>
             <w:tcBorders>
               <w:bottom w:val="none" w:sz="0" w:space="0" w:color="000000"/>
               <w:top w:val="none" w:sz="0" w:space="0" w:color="000000"/>
@@ -4769,19 +4653,6 @@
                 <w:color w:val="000000"/>
               </w:rPr>
             </w:pPr>
-            <w:r>
-              <w:rPr>
-                <w:rFonts w:ascii="Arial" w:hAnsi="Arial" w:eastAsia="Arial" w:cs="Arial"/>
-                <w:i w:val="false"/>
-                <w:b w:val="false"/>
-                <w:u w:val="none"/>
-                <w:strike w:val="false"/>
-                <w:sz w:val="20"/>
-                <w:szCs w:val="20"/>
-                <w:color w:val="000000"/>
-              </w:rPr>
-              <w:t xml:space="preserve">CHG</w:t>
-            </w:r>
           </w:p>
         </w:tc>
         <w:tc>
@@ -5066,6 +4937,7 @@
         </w:trPr>
         <w:tc>
           <w:tcPr>
+            <w:vMerge/>
             <w:tcBorders>
               <w:bottom w:val="none" w:sz="0" w:space="0" w:color="000000"/>
               <w:top w:val="none" w:sz="0" w:space="0" w:color="000000"/>
@@ -5104,19 +4976,6 @@
                 <w:color w:val="000000"/>
               </w:rPr>
             </w:pPr>
-            <w:r>
-              <w:rPr>
-                <w:rFonts w:ascii="Arial" w:hAnsi="Arial" w:eastAsia="Arial" w:cs="Arial"/>
-                <w:i w:val="false"/>
-                <w:b w:val="false"/>
-                <w:u w:val="none"/>
-                <w:strike w:val="false"/>
-                <w:sz w:val="20"/>
-                <w:szCs w:val="20"/>
-                <w:color w:val="000000"/>
-              </w:rPr>
-              <w:t xml:space="preserve">CHG</w:t>
-            </w:r>
           </w:p>
         </w:tc>
         <w:tc>
@@ -5401,8 +5260,9 @@
         </w:trPr>
         <w:tc>
           <w:tcPr>
-            <w:tcBorders>
-              <w:bottom w:val="none" w:sz="0" w:space="0" w:color="000000"/>
+            <w:vMerge w:val="restart"/>
+            <w:tcBorders>
+              <w:bottom w:val="single" w:sz="12" w:space="0" w:color="666666"/>
               <w:top w:val="none" w:sz="0" w:space="0" w:color="000000"/>
               <w:left w:val="none" w:sz="0" w:space="0" w:color="000000"/>
               <w:right w:val="none" w:sz="0" w:space="0" w:color="000000"/>
@@ -5736,9 +5596,10 @@
         </w:trPr>
         <w:tc>
           <w:tcPr>
-            <w:tcBorders>
-              <w:bottom w:val="none" w:sz="0" w:space="0" w:color="000000"/>
-              <w:top w:val="none" w:sz="0" w:space="0" w:color="000000"/>
+            <w:vMerge/>
+            <w:tcBorders>
+              <w:bottom w:val="none" w:sz="0" w:space="0" w:color="000000"/>
+              <w:top w:val="single" w:sz="12" w:space="0" w:color="666666"/>
               <w:left w:val="none" w:sz="0" w:space="0" w:color="000000"/>
               <w:right w:val="none" w:sz="0" w:space="0" w:color="000000"/>
             </w:tcBorders>
@@ -5774,19 +5635,6 @@
                 <w:color w:val="000000"/>
               </w:rPr>
             </w:pPr>
-            <w:r>
-              <w:rPr>
-                <w:rFonts w:ascii="Arial" w:hAnsi="Arial" w:eastAsia="Arial" w:cs="Arial"/>
-                <w:i w:val="false"/>
-                <w:b w:val="false"/>
-                <w:u w:val="none"/>
-                <w:strike w:val="false"/>
-                <w:sz w:val="20"/>
-                <w:szCs w:val="20"/>
-                <w:color w:val="000000"/>
-              </w:rPr>
-              <w:t xml:space="preserve">CHH</w:t>
-            </w:r>
           </w:p>
         </w:tc>
         <w:tc>
@@ -6005,7 +5853,7 @@
                 <w:szCs w:val="20"/>
                 <w:color w:val="000000"/>
               </w:rPr>
-              <w:t xml:space="preserve">0.337</w:t>
+              <w:t xml:space="preserve">0.341</w:t>
             </w:r>
           </w:p>
         </w:tc>
@@ -6071,6 +5919,7 @@
         </w:trPr>
         <w:tc>
           <w:tcPr>
+            <w:vMerge/>
             <w:tcBorders>
               <w:bottom w:val="none" w:sz="0" w:space="0" w:color="000000"/>
               <w:top w:val="none" w:sz="0" w:space="0" w:color="000000"/>
@@ -6109,19 +5958,6 @@
                 <w:color w:val="000000"/>
               </w:rPr>
             </w:pPr>
-            <w:r>
-              <w:rPr>
-                <w:rFonts w:ascii="Arial" w:hAnsi="Arial" w:eastAsia="Arial" w:cs="Arial"/>
-                <w:i w:val="false"/>
-                <w:b w:val="false"/>
-                <w:u w:val="none"/>
-                <w:strike w:val="false"/>
-                <w:sz w:val="20"/>
-                <w:szCs w:val="20"/>
-                <w:color w:val="000000"/>
-              </w:rPr>
-              <w:t xml:space="preserve">CHH</w:t>
-            </w:r>
           </w:p>
         </w:tc>
         <w:tc>
@@ -6406,6 +6242,7 @@
         </w:trPr>
         <w:tc>
           <w:tcPr>
+            <w:vMerge/>
             <w:tcBorders>
               <w:bottom w:val="none" w:sz="0" w:space="0" w:color="000000"/>
               <w:top w:val="none" w:sz="0" w:space="0" w:color="000000"/>
@@ -6444,19 +6281,6 @@
                 <w:color w:val="000000"/>
               </w:rPr>
             </w:pPr>
-            <w:r>
-              <w:rPr>
-                <w:rFonts w:ascii="Arial" w:hAnsi="Arial" w:eastAsia="Arial" w:cs="Arial"/>
-                <w:i w:val="false"/>
-                <w:b w:val="false"/>
-                <w:u w:val="none"/>
-                <w:strike w:val="false"/>
-                <w:sz w:val="20"/>
-                <w:szCs w:val="20"/>
-                <w:color w:val="000000"/>
-              </w:rPr>
-              <w:t xml:space="preserve">CHH</w:t>
-            </w:r>
           </w:p>
         </w:tc>
         <w:tc>
@@ -6741,6 +6565,7 @@
         </w:trPr>
         <w:tc>
           <w:tcPr>
+            <w:vMerge/>
             <w:tcBorders>
               <w:bottom w:val="single" w:sz="12" w:space="0" w:color="666666"/>
               <w:top w:val="none" w:sz="0" w:space="0" w:color="000000"/>
@@ -6779,19 +6604,6 @@
                 <w:color w:val="000000"/>
               </w:rPr>
             </w:pPr>
-            <w:r>
-              <w:rPr>
-                <w:rFonts w:ascii="Arial" w:hAnsi="Arial" w:eastAsia="Arial" w:cs="Arial"/>
-                <w:i w:val="false"/>
-                <w:b w:val="false"/>
-                <w:u w:val="none"/>
-                <w:strike w:val="false"/>
-                <w:sz w:val="20"/>
-                <w:szCs w:val="20"/>
-                <w:color w:val="000000"/>
-              </w:rPr>
-              <w:t xml:space="preserve">CHH</w:t>
-            </w:r>
           </w:p>
         </w:tc>
         <w:tc>
@@ -7872,7 +7684,7 @@
                 <w:szCs w:val="20"/>
                 <w:color w:val="000000"/>
               </w:rPr>
-              <w:t xml:space="preserve">0.0732732680</w:t>
+              <w:t xml:space="preserve">0.073</w:t>
             </w:r>
           </w:p>
         </w:tc>
@@ -8183,7 +7995,7 @@
                 <w:szCs w:val="20"/>
                 <w:color w:val="000000"/>
               </w:rPr>
-              <w:t xml:space="preserve">0.205</w:t>
+              <w:t xml:space="preserve">0.207</w:t>
             </w:r>
           </w:p>
         </w:tc>
@@ -8238,7 +8050,7 @@
                 <w:szCs w:val="20"/>
                 <w:color w:val="000000"/>
               </w:rPr>
-              <w:t xml:space="preserve">0.0014846247</w:t>
+              <w:t xml:space="preserve">0.001</w:t>
             </w:r>
           </w:p>
         </w:tc>
@@ -8604,7 +8416,7 @@
                 <w:szCs w:val="20"/>
                 <w:color w:val="000000"/>
               </w:rPr>
-              <w:t xml:space="preserve">0.0020747552</w:t>
+              <w:t xml:space="preserve">0.002</w:t>
             </w:r>
           </w:p>
         </w:tc>
@@ -8983,7 +8795,7 @@
                 <w:szCs w:val="20"/>
                 <w:color w:val="000000"/>
               </w:rPr>
-              <w:t xml:space="preserve">0.1678004520</w:t>
+              <w:t xml:space="preserve">0.168</w:t>
             </w:r>
           </w:p>
         </w:tc>
@@ -9294,7 +9106,7 @@
                 <w:szCs w:val="20"/>
                 <w:color w:val="000000"/>
               </w:rPr>
-              <w:t xml:space="preserve">0.188</w:t>
+              <w:t xml:space="preserve">0.193</w:t>
             </w:r>
           </w:p>
         </w:tc>
@@ -9349,7 +9161,7 @@
                 <w:szCs w:val="20"/>
                 <w:color w:val="000000"/>
               </w:rPr>
-              <w:t xml:space="preserve">0.0032285587</w:t>
+              <w:t xml:space="preserve">0.003</w:t>
             </w:r>
           </w:p>
         </w:tc>
@@ -9660,7 +9472,7 @@
                 <w:szCs w:val="20"/>
                 <w:color w:val="000000"/>
               </w:rPr>
-              <w:t xml:space="preserve">0.175</w:t>
+              <w:t xml:space="preserve">0.170</w:t>
             </w:r>
           </w:p>
         </w:tc>
@@ -9715,7 +9527,7 @@
                 <w:szCs w:val="20"/>
                 <w:color w:val="000000"/>
               </w:rPr>
-              <w:t xml:space="preserve">0.0042151349</w:t>
+              <w:t xml:space="preserve">0.004</w:t>
             </w:r>
           </w:p>
         </w:tc>
@@ -10094,7 +9906,7 @@
                 <w:szCs w:val="20"/>
                 <w:color w:val="000000"/>
               </w:rPr>
-              <w:t xml:space="preserve">0.0521975294</w:t>
+              <w:t xml:space="preserve">0.052</w:t>
             </w:r>
           </w:p>
         </w:tc>
@@ -10405,7 +10217,7 @@
                 <w:szCs w:val="20"/>
                 <w:color w:val="000000"/>
               </w:rPr>
-              <w:t xml:space="preserve">0.234</w:t>
+              <w:t xml:space="preserve">0.232</w:t>
             </w:r>
           </w:p>
         </w:tc>
@@ -10460,7 +10272,7 @@
                 <w:szCs w:val="20"/>
                 <w:color w:val="000000"/>
               </w:rPr>
-              <w:t xml:space="preserve">0.0008727531</w:t>
+              <w:t xml:space="preserve">0.001</w:t>
             </w:r>
           </w:p>
         </w:tc>
@@ -10771,7 +10583,7 @@
                 <w:szCs w:val="20"/>
                 <w:color w:val="000000"/>
               </w:rPr>
-              <w:t xml:space="preserve">0.147</w:t>
+              <w:t xml:space="preserve">0.144</w:t>
             </w:r>
           </w:p>
         </w:tc>
@@ -10826,7 +10638,7 @@
                 <w:szCs w:val="20"/>
                 <w:color w:val="000000"/>
               </w:rPr>
-              <w:t xml:space="preserve">0.0018878749</w:t>
+              <w:t xml:space="preserve">0.002</w:t>
             </w:r>
           </w:p>
         </w:tc>
@@ -11205,7 +11017,7 @@
                 <w:szCs w:val="20"/>
                 <w:color w:val="000000"/>
               </w:rPr>
-              <w:t xml:space="preserve">0.0393309147</w:t>
+              <w:t xml:space="preserve">0.039</w:t>
             </w:r>
           </w:p>
         </w:tc>
@@ -11516,7 +11328,7 @@
                 <w:szCs w:val="20"/>
                 <w:color w:val="000000"/>
               </w:rPr>
-              <w:t xml:space="preserve">0.185</w:t>
+              <w:t xml:space="preserve">0.180</w:t>
             </w:r>
           </w:p>
         </w:tc>
@@ -11571,7 +11383,7 @@
                 <w:szCs w:val="20"/>
                 <w:color w:val="000000"/>
               </w:rPr>
-              <w:t xml:space="preserve">0.0011440630</w:t>
+              <w:t xml:space="preserve">0.001</w:t>
             </w:r>
           </w:p>
         </w:tc>
@@ -11882,7 +11694,7 @@
                 <w:szCs w:val="20"/>
                 <w:color w:val="000000"/>
               </w:rPr>
-              <w:t xml:space="preserve">0.214</w:t>
+              <w:t xml:space="preserve">0.215</w:t>
             </w:r>
           </w:p>
         </w:tc>
@@ -11937,7 +11749,7 @@
                 <w:szCs w:val="20"/>
                 <w:color w:val="000000"/>
               </w:rPr>
-              <w:t xml:space="preserve">0.0009343783</w:t>
+              <w:t xml:space="preserve">0.001</w:t>
             </w:r>
           </w:p>
         </w:tc>
@@ -12761,7 +12573,7 @@
                 <w:szCs w:val="20"/>
                 <w:color w:val="000000"/>
               </w:rPr>
-              <w:t xml:space="preserve">0.015*</w:t>
+              <w:t xml:space="preserve">0.012*</w:t>
             </w:r>
           </w:p>
         </w:tc>
@@ -13746,8 +13558,9 @@
         </w:trPr>
         <w:tc>
           <w:tcPr>
-            <w:tcBorders>
-              <w:bottom w:val="none" w:sz="0" w:space="0" w:color="000000"/>
+            <w:vMerge w:val="restart"/>
+            <w:tcBorders>
+              <w:bottom w:val="single" w:sz="12" w:space="0" w:color="666666"/>
               <w:top w:val="single" w:sz="12" w:space="0" w:color="666666"/>
               <w:left w:val="none" w:sz="0" w:space="0" w:color="000000"/>
               <w:right w:val="none" w:sz="0" w:space="0" w:color="000000"/>
@@ -14070,7 +13883,7 @@
                 <w:szCs w:val="20"/>
                 <w:color w:val="000000"/>
               </w:rPr>
-              <w:t xml:space="preserve">0.21652199</w:t>
+              <w:t xml:space="preserve">0.217</w:t>
             </w:r>
           </w:p>
         </w:tc>
@@ -14081,9 +13894,10 @@
         </w:trPr>
         <w:tc>
           <w:tcPr>
-            <w:tcBorders>
-              <w:bottom w:val="none" w:sz="0" w:space="0" w:color="000000"/>
-              <w:top w:val="none" w:sz="0" w:space="0" w:color="000000"/>
+            <w:vMerge/>
+            <w:tcBorders>
+              <w:bottom w:val="none" w:sz="0" w:space="0" w:color="000000"/>
+              <w:top w:val="single" w:sz="12" w:space="0" w:color="666666"/>
               <w:left w:val="none" w:sz="0" w:space="0" w:color="000000"/>
               <w:right w:val="none" w:sz="0" w:space="0" w:color="000000"/>
             </w:tcBorders>
@@ -14119,19 +13933,6 @@
                 <w:color w:val="000000"/>
               </w:rPr>
             </w:pPr>
-            <w:r>
-              <w:rPr>
-                <w:rFonts w:ascii="Arial" w:hAnsi="Arial" w:eastAsia="Arial" w:cs="Arial"/>
-                <w:i w:val="false"/>
-                <w:b w:val="false"/>
-                <w:u w:val="none"/>
-                <w:strike w:val="false"/>
-                <w:sz w:val="20"/>
-                <w:szCs w:val="20"/>
-                <w:color w:val="000000"/>
-              </w:rPr>
-              <w:t xml:space="preserve">PhenoDist ~ M * S</w:t>
-            </w:r>
           </w:p>
         </w:tc>
         <w:tc>
@@ -14350,7 +14151,7 @@
                 <w:szCs w:val="20"/>
                 <w:color w:val="000000"/>
               </w:rPr>
-              <w:t xml:space="preserve">0.001**</w:t>
+              <w:t xml:space="preserve">0.002**</w:t>
             </w:r>
           </w:p>
         </w:tc>
@@ -14405,7 +14206,7 @@
                 <w:szCs w:val="20"/>
                 <w:color w:val="000000"/>
               </w:rPr>
-              <w:t xml:space="preserve">0.04775929</w:t>
+              <w:t xml:space="preserve">0.048</w:t>
             </w:r>
           </w:p>
         </w:tc>
@@ -14416,6 +14217,7 @@
         </w:trPr>
         <w:tc>
           <w:tcPr>
+            <w:vMerge/>
             <w:tcBorders>
               <w:bottom w:val="single" w:sz="12" w:space="0" w:color="666666"/>
               <w:top w:val="none" w:sz="0" w:space="0" w:color="000000"/>
@@ -14454,19 +14256,6 @@
                 <w:color w:val="000000"/>
               </w:rPr>
             </w:pPr>
-            <w:r>
-              <w:rPr>
-                <w:rFonts w:ascii="Arial" w:hAnsi="Arial" w:eastAsia="Arial" w:cs="Arial"/>
-                <w:i w:val="false"/>
-                <w:b w:val="false"/>
-                <w:u w:val="none"/>
-                <w:strike w:val="false"/>
-                <w:sz w:val="20"/>
-                <w:szCs w:val="20"/>
-                <w:color w:val="000000"/>
-              </w:rPr>
-              <w:t xml:space="preserve">PhenoDist ~ M * S</w:t>
-            </w:r>
           </w:p>
         </w:tc>
         <w:tc>
@@ -14685,7 +14474,7 @@
                 <w:szCs w:val="20"/>
                 <w:color w:val="000000"/>
               </w:rPr>
-              <w:t xml:space="preserve">0.103</w:t>
+              <w:t xml:space="preserve">0.111</w:t>
             </w:r>
           </w:p>
         </w:tc>
@@ -14740,7 +14529,7 @@
                 <w:szCs w:val="20"/>
                 <w:color w:val="000000"/>
               </w:rPr>
-              <w:t xml:space="preserve">0.01277465</w:t>
+              <w:t xml:space="preserve">0.013</w:t>
             </w:r>
           </w:p>
         </w:tc>

</xml_diff>